<commit_message>
docs: cenario de lucro, PR-AUC e novos trabalhos relacionados no relatorio
Inclui Bult e Wansbeek (1995), Chou et al. (2022), Liu et al. (2016), Zaghloul et al. (2025) e as metricas preditivas do Google Analytics 4.
</commit_message>
<xml_diff>
--- a/Projeto_Final_ML_Online_Retail.docx
+++ b/Projeto_Final_ML_Online_Retail.docx
@@ -639,7 +639,21 @@
           <w:rFonts w:ascii="Times New Roman" w:hAnsi="Times New Roman"/>
           <w:sz w:val="24"/>
         </w:rPr>
-        <w:t>Avaliar a classificação com matriz de confusão, precisão, recall, especificidade, F1, F1-macro e curva ROC, com o limiar de decisão escolhido sem usar o conjunto de teste.</w:t>
+        <w:t>Avaliar a classificação com matriz de confusão, precisão, recall, especificidade, F1, F1-macro, curva ROC e curva precisão x recall (PR-AUC), com o limiar de decisão escolhido sem usar o conjunto de teste.</w:t>
+      </w:r>
+    </w:p>
+    <w:p>
+      <w:pPr>
+        <w:pStyle w:val="ListBullet"/>
+        <w:spacing w:line="360" w:lineRule="auto"/>
+        <w:jc w:val="both"/>
+      </w:pPr>
+      <w:r>
+        <w:rPr>
+          <w:rFonts w:ascii="Times New Roman" w:hAnsi="Times New Roman"/>
+          <w:sz w:val="24"/>
+        </w:rPr>
+        <w:t>Escolher o limiar de decisão também pelo custo do erro, com um cenário de lucro de campanha em três níveis de custo por contato.</w:t>
       </w:r>
     </w:p>
     <w:p>
@@ -826,7 +840,22 @@
           <w:i w:val="0"/>
           <w:sz w:val="24"/>
         </w:rPr>
-        <w:t>No mercado, a previsão de recompra costuma usar modelos probabilísticos da família "Buy 'Til You Die". O Pareto/NBD (SCHMITTLEIN; MORRISON; COLOMBO, 1987) e a sua versão simplificada, o BG/NBD (FADER; HARDIE; LEE, 2005), estimam, apenas com recência, frequência e tempo de relacionamento, a probabilidade de o cliente ainda estar ativo e quantas compras ele deve fazer. Plataformas de automação de marketing para e-commerce já trazem esse tipo de previsão pronta. A Klaviyo, por exemplo, calcula para cada cliente o valor previsto de compras no próximo ano, o risco de churn e o tempo médio entre pedidos. O recurso exige pelo menos 500 clientes com pedidos, 180 dias de histórico com pedidos nos últimos 30 dias e alguns clientes com três ou mais pedidos, e o modelo é re-treinado ao menos uma vez por semana (KLAVIYO, [2026]).</w:t>
+        <w:t>No mercado, a previsão de recompra costuma usar modelos probabilísticos da família "Buy 'Til You Die". O Pareto/NBD (SCHMITTLEIN; MORRISON; COLOMBO, 1987) e a sua versão simplificada, o BG/NBD (FADER; HARDIE; LEE, 2005), estimam, apenas com recência, frequência e tempo de relacionamento, a probabilidade de o cliente ainda estar ativo e quantas compras ele deve fazer. Plataformas de automação de marketing para e-commerce já trazem esse tipo de previsão pronta. A Klaviyo, por exemplo, calcula para cada cliente o valor previsto de compras no próximo ano, o risco de churn e o tempo médio entre pedidos. O recurso exige pelo menos 500 clientes com pedidos, 180 dias de histórico com pedidos nos últimos 30 dias e alguns clientes com três ou mais pedidos, e o modelo é re-treinado ao menos uma vez por semana (KLAVIYO, [2026]). O Google Analytics 4 oferece métricas parecidas para qualquer loja que envie os eventos de compra: a probabilidade de um usuário ativo nos últimos 28 dias comprar nos próximos 7, a probabilidade de churn e a receita prevista para os próximos 28 dias. Para liberar os modelos, a ferramenta exige que, em uma janela de sete dias dentro dos últimos 28, pelo menos 1.000 usuários recorrentes tenham comprado e 1.000 não (GOOGLE, [2026]). É o mesmo problema deste trabalho, em uma escala de dias em vez de trimestre.</w:t>
+      </w:r>
+    </w:p>
+    <w:p>
+      <w:pPr>
+        <w:spacing w:line="360" w:lineRule="auto" w:after="120"/>
+        <w:jc w:val="both"/>
+      </w:pPr>
+      <w:r>
+        <w:rPr>
+          <w:rFonts w:ascii="Times New Roman" w:hAnsi="Times New Roman"/>
+          <w:b w:val="0"/>
+          <w:i w:val="0"/>
+          <w:sz w:val="24"/>
+        </w:rPr>
+        <w:t>Essas ferramentas mostram duas coisas. A primeira é que prever recompra já é prática corrente no mercado, e não só um exercício acadêmico. A segunda é que a previsão só vira decisão quando se escolhe quem recebe a ação. Bult e Wansbeek (1995), estudando a seleção de clientes para mala direta, mostraram que a regra ótima é enviar a oferta a quem tem retorno esperado maior que o custo do envio, ou seja, quando a probabilidade de resposta passa da razão entre custo e retorno. Essa regra é a base do cenário de lucro da seção 4.5.</w:t>
       </w:r>
     </w:p>
     <w:p>
@@ -842,6 +871,36 @@
           <w:sz w:val="24"/>
         </w:rPr>
         <w:t>Entre os trabalhos acadêmicos com o mesmo dataset, Chen, Sain e Guo (2012), que publicaram a base, segmentaram os clientes do varejista por RFM com o algoritmo k-means e árvores de decisão, chegando a cinco grupos de clientes. Ozturk (2026) resolve o mesmo problema de classificação deste trabalho: transforma o Online Retail em uma previsão de recompra em 90 dias, segmenta os clientes por RFM e compara regressão logística, random forest e gradient boosting. O melhor resultado foi do random forest, com ROC-AUC de 0,750; a regressão logística ficou pouco abaixo, com a vantagem de ser mais interpretável. No mesmo estudo, o segmento dos melhores clientes reunia 27,5% da base e 67,2% da receita recente. Verma et al. (2025) compararam oito classificadores, entre eles regressão logística e KNN, sobre variáveis RFM do mesmo varejista: a maioria ficou perto de 73% de acurácia, o melhor (XGBoost) chegou a 73,9% e ROC-AUC de 0,80, e os autores atribuem o bom desempenho dos modelos simples à engenharia de atributos. Como a unidade de análise desse estudo é a nota fiscal, e não o cliente, a comparação direta com este trabalho é só indicativa.</w:t>
+      </w:r>
+    </w:p>
+    <w:p>
+      <w:pPr>
+        <w:spacing w:line="360" w:lineRule="auto" w:after="120"/>
+        <w:jc w:val="both"/>
+      </w:pPr>
+      <w:r>
+        <w:rPr>
+          <w:rFonts w:ascii="Times New Roman" w:hAnsi="Times New Roman"/>
+          <w:b w:val="0"/>
+          <w:i w:val="0"/>
+          <w:sz w:val="24"/>
+        </w:rPr>
+        <w:t>Fora deste dataset, dois trabalhos ajudam a situar o resultado. Chou et al. (2022) combinaram as duas tradições: usaram a estimativa de um modelo "Buy 'Til You Die" (BG/BB) como variável de entrada de uma regressão com regularização Lasso para prever a recompra no trimestre seguinte, e essa estimativa foi a variável mais importante entre cerca de cem. Ou seja, os modelos probabilísticos e o Machine Learning se complementam. Liu et al. (2016) descrevem a competição de previsão de recompra do Tmall, marketplace do grupo Alibaba: a solução vencedora gerou 1.364 variáveis e combinou vários modelos, e mesmo assim chegou a uma ROC-AUC de 0,705. Prever se um cliente volta é um problema com teto baixo, mesmo com muito mais informação do que a usada aqui.</w:t>
+      </w:r>
+    </w:p>
+    <w:p>
+      <w:pPr>
+        <w:spacing w:line="360" w:lineRule="auto" w:after="120"/>
+        <w:jc w:val="both"/>
+      </w:pPr>
+      <w:r>
+        <w:rPr>
+          <w:rFonts w:ascii="Times New Roman" w:hAnsi="Times New Roman"/>
+          <w:b w:val="0"/>
+          <w:i w:val="0"/>
+          <w:sz w:val="24"/>
+        </w:rPr>
+        <w:t>A literatura também mostra o cuidado necessário com a construção do alvo. Zaghloul, Barakat e Rezk (2025) relatam acurácias de 99,5% no mesmo Online Retail, mas os rótulos de churn foram gerados por agrupamento k-means sobre as próprias variáveis RFM. Nesse desenho, o classificador aprende a reproduzir a regra de agrupamento a partir das mesmas variáveis que a criaram, e não o comportamento futuro do cliente. Neste trabalho, o alvo vem de uma janela de tempo posterior às features, o que explica números mais modestos e mais honestos.</w:t>
       </w:r>
     </w:p>
     <w:p>
@@ -2820,7 +2879,7 @@
           <w:i w:val="0"/>
           <w:sz w:val="24"/>
         </w:rPr>
-        <w:t>Escolha do limiar de decisão: os modelos de classificação entregam uma probabilidade, e transformá-la em decisão exige um limiar. O grupo escolhe o limiar sem olhar o conjunto de teste: usa as probabilidades de validação cruzada do próprio treino (cross_val_predict) e, sem os custos reais da campanha, adota um critério neutro, o limiar que maximiza a acurácia balanceada, média entre recall e especificidade. O resultado é 0,60 para a Regressão Logística e 0,58 para o KNN. O RFM manual segue a mesma regra para escolher a nota de corte, que fica em 9 (de 3 a 15), o que torna a comparação justa. A Figura 6 e a Tabela 4 mostram a troca que a empresa precisa decidir: um limiar baixo aciona quase todos os clientes, com recall alto e muitos contatos inúteis; um limiar alto aciona só os mais prováveis, com precisão alta e recompradores deixados de fora.</w:t>
+        <w:t>Escolha do limiar de decisão: os modelos de classificação entregam uma probabilidade, e transformá-la em decisão exige um limiar. O grupo escolhe o limiar sem olhar o conjunto de teste: usa as probabilidades de validação cruzada do próprio treino (cross_val_predict) e, sem os custos reais da campanha, adota um critério neutro, o limiar que maximiza a acurácia balanceada, média entre recall e especificidade. O resultado é 0,60 para a Regressão Logística e 0,58 para o KNN. O RFM manual segue a mesma regra para escolher a nota de corte, que fica em 9 (de 3 a 15), o que torna a comparação justa. A Figura 6 e a Tabela 4 mostram a troca que a empresa precisa decidir: um limiar baixo aciona quase todos os clientes, com recall alto e muitos contatos inúteis; um limiar alto aciona só os mais prováveis, com precisão alta e recompradores deixados de fora. A seção 4.5 refaz a escolha pelo custo do erro, com um cenário de lucro de campanha.</w:t>
       </w:r>
     </w:p>
     <w:p>
@@ -4590,7 +4649,7 @@
           <w:i w:val="0"/>
           <w:sz w:val="24"/>
         </w:rPr>
-        <w:t>Justificativa das métricas: com classes quase equilibradas, a acurácia sozinha ainda engana, porque o baseline "todos recompram" acerta a maioria dos casos. O grupo reporta a matriz de confusão e as métricas derivadas dela: precisão (dos clientes apontados como recompradores, quantos recompraram), recall (dos recompradores reais, quantos o modelo encontrou), especificidade (dos que não recompraram, quantos o modelo identificou), F1 da classe positiva e F1-macro, a média do F1 das duas classes. A ROC-AUC avalia a ordenação dos clientes pela probabilidade, independente do limiar.</w:t>
+        <w:t>Justificativa das métricas: com classes quase equilibradas, a acurácia sozinha ainda engana, porque o baseline "todos recompram" acerta a maioria dos casos. O grupo reporta a matriz de confusão e as métricas derivadas dela: precisão (dos clientes apontados como recompradores, quantos recompraram), recall (dos recompradores reais, quantos o modelo encontrou), especificidade (dos que não recompraram, quantos o modelo identificou), F1 da classe positiva e F1-macro, a média do F1 das duas classes. A ROC-AUC avalia a ordenação dos clientes pela probabilidade, independente do limiar. A PR-AUC (precisão média) resume a curva precisão x recall e olha a lista pelo lado de quem vai acionar os clientes: conforme se desce na lista, quantos dos acionados de fato recompram. Ao contrário da ROC-AUC, sua referência sem poder de ordenação não é 0,5, e sim a proporção de positivos, 0,571 no teste.</w:t>
       </w:r>
     </w:p>
     <w:p>
@@ -5306,6 +5365,9 @@
             <w:tcW w:type="dxa" w:w="1881"/>
           </w:tcPr>
           <w:p>
+            <w:pPr>
+              <w:keepNext/>
+            </w:pPr>
             <w:r/>
             <w:r>
               <w:rPr>
@@ -5321,6 +5383,9 @@
             <w:tcW w:type="dxa" w:w="1881"/>
           </w:tcPr>
           <w:p>
+            <w:pPr>
+              <w:keepNext/>
+            </w:pPr>
             <w:r/>
             <w:r>
               <w:rPr>
@@ -5336,6 +5401,9 @@
             <w:tcW w:type="dxa" w:w="1881"/>
           </w:tcPr>
           <w:p>
+            <w:pPr>
+              <w:keepNext/>
+            </w:pPr>
             <w:r/>
             <w:r>
               <w:rPr>
@@ -5351,6 +5419,9 @@
             <w:tcW w:type="dxa" w:w="1881"/>
           </w:tcPr>
           <w:p>
+            <w:pPr>
+              <w:keepNext/>
+            </w:pPr>
             <w:r/>
             <w:r>
               <w:rPr>
@@ -5366,6 +5437,9 @@
             <w:tcW w:type="dxa" w:w="1881"/>
           </w:tcPr>
           <w:p>
+            <w:pPr>
+              <w:keepNext/>
+            </w:pPr>
             <w:r/>
             <w:r>
               <w:rPr>
@@ -5373,6 +5447,86 @@
                 <w:sz w:val="20"/>
               </w:rPr>
               <w:t>0,746</w:t>
+            </w:r>
+          </w:p>
+        </w:tc>
+      </w:tr>
+      <w:tr>
+        <w:trPr>
+          <w:cantSplit/>
+        </w:trPr>
+        <w:tc>
+          <w:tcPr>
+            <w:tcW w:type="dxa" w:w="1881"/>
+          </w:tcPr>
+          <w:p>
+            <w:r/>
+            <w:r>
+              <w:rPr>
+                <w:rFonts w:ascii="Times New Roman" w:hAnsi="Times New Roman"/>
+                <w:sz w:val="20"/>
+              </w:rPr>
+              <w:t>PR-AUC</w:t>
+            </w:r>
+          </w:p>
+        </w:tc>
+        <w:tc>
+          <w:tcPr>
+            <w:tcW w:type="dxa" w:w="1881"/>
+          </w:tcPr>
+          <w:p>
+            <w:r/>
+            <w:r>
+              <w:rPr>
+                <w:rFonts w:ascii="Times New Roman" w:hAnsi="Times New Roman"/>
+                <w:sz w:val="20"/>
+              </w:rPr>
+              <w:t>0,571</w:t>
+            </w:r>
+          </w:p>
+        </w:tc>
+        <w:tc>
+          <w:tcPr>
+            <w:tcW w:type="dxa" w:w="1881"/>
+          </w:tcPr>
+          <w:p>
+            <w:r/>
+            <w:r>
+              <w:rPr>
+                <w:rFonts w:ascii="Times New Roman" w:hAnsi="Times New Roman"/>
+                <w:sz w:val="20"/>
+              </w:rPr>
+              <w:t>0,798</w:t>
+            </w:r>
+          </w:p>
+        </w:tc>
+        <w:tc>
+          <w:tcPr>
+            <w:tcW w:type="dxa" w:w="1881"/>
+          </w:tcPr>
+          <w:p>
+            <w:r/>
+            <w:r>
+              <w:rPr>
+                <w:rFonts w:ascii="Times New Roman" w:hAnsi="Times New Roman"/>
+                <w:sz w:val="20"/>
+              </w:rPr>
+              <w:t>0,823</w:t>
+            </w:r>
+          </w:p>
+        </w:tc>
+        <w:tc>
+          <w:tcPr>
+            <w:tcW w:type="dxa" w:w="1881"/>
+          </w:tcPr>
+          <w:p>
+            <w:r/>
+            <w:r>
+              <w:rPr>
+                <w:rFonts w:ascii="Times New Roman" w:hAnsi="Times New Roman"/>
+                <w:sz w:val="20"/>
+              </w:rPr>
+              <w:t>0,817</w:t>
             </w:r>
           </w:p>
         </w:tc>
@@ -5471,7 +5625,75 @@
           <w:b/>
           <w:sz w:val="20"/>
         </w:rPr>
-        <w:t>Figura 11 - Matrizes de confusão no conjunto de teste</w:t>
+        <w:t>Figura 11 - Curvas precisão x recall no conjunto de teste (pontos: limiar escolhido na validação)</w:t>
+      </w:r>
+    </w:p>
+    <w:p>
+      <w:pPr>
+        <w:keepNext/>
+        <w:jc w:val="center"/>
+      </w:pPr>
+      <w:r>
+        <w:drawing>
+          <wp:inline xmlns:a="http://schemas.openxmlformats.org/drawingml/2006/main" xmlns:pic="http://schemas.openxmlformats.org/drawingml/2006/picture">
+            <wp:extent cx="4140000" cy="3835588"/>
+            <wp:docPr id="11" name="Picture 11"/>
+            <wp:cNvGraphicFramePr>
+              <a:graphicFrameLocks noChangeAspect="1"/>
+            </wp:cNvGraphicFramePr>
+            <a:graphic>
+              <a:graphicData uri="http://schemas.openxmlformats.org/drawingml/2006/picture">
+                <pic:pic>
+                  <pic:nvPicPr>
+                    <pic:cNvPr id="0" name="classificacao_precisao_recall.png"/>
+                    <pic:cNvPicPr/>
+                  </pic:nvPicPr>
+                  <pic:blipFill>
+                    <a:blip r:embed="rId20"/>
+                    <a:stretch>
+                      <a:fillRect/>
+                    </a:stretch>
+                  </pic:blipFill>
+                  <pic:spPr>
+                    <a:xfrm>
+                      <a:off x="0" y="0"/>
+                      <a:ext cx="4140000" cy="3835588"/>
+                    </a:xfrm>
+                    <a:prstGeom prst="rect"/>
+                  </pic:spPr>
+                </pic:pic>
+              </a:graphicData>
+            </a:graphic>
+          </wp:inline>
+        </w:drawing>
+      </w:r>
+    </w:p>
+    <w:p>
+      <w:pPr>
+        <w:spacing w:line="240" w:lineRule="auto" w:before="40" w:after="240"/>
+        <w:jc w:val="center"/>
+      </w:pPr>
+      <w:r>
+        <w:rPr>
+          <w:rFonts w:ascii="Times New Roman" w:hAnsi="Times New Roman"/>
+          <w:sz w:val="20"/>
+        </w:rPr>
+        <w:t>Fonte: Elaborado pelos autores (2026).</w:t>
+      </w:r>
+    </w:p>
+    <w:p>
+      <w:pPr>
+        <w:keepNext/>
+        <w:spacing w:line="240" w:lineRule="auto" w:before="120" w:after="80"/>
+        <w:jc w:val="center"/>
+      </w:pPr>
+      <w:r>
+        <w:rPr>
+          <w:rFonts w:ascii="Times New Roman" w:hAnsi="Times New Roman"/>
+          <w:b/>
+          <w:sz w:val="20"/>
+        </w:rPr>
+        <w:t>Figura 12 - Matrizes de confusão no conjunto de teste</w:t>
       </w:r>
     </w:p>
     <w:p>
@@ -5483,7 +5705,7 @@
         <w:drawing>
           <wp:inline xmlns:a="http://schemas.openxmlformats.org/drawingml/2006/main" xmlns:pic="http://schemas.openxmlformats.org/drawingml/2006/picture">
             <wp:extent cx="5580000" cy="2130545"/>
-            <wp:docPr id="11" name="Picture 11"/>
+            <wp:docPr id="12" name="Picture 12"/>
             <wp:cNvGraphicFramePr>
               <a:graphicFrameLocks noChangeAspect="1"/>
             </wp:cNvGraphicFramePr>
@@ -5495,7 +5717,7 @@
                     <pic:cNvPicPr/>
                   </pic:nvPicPr>
                   <pic:blipFill>
-                    <a:blip r:embed="rId20"/>
+                    <a:blip r:embed="rId21"/>
                     <a:stretch>
                       <a:fillRect/>
                     </a:stretch>
@@ -5539,7 +5761,7 @@
           <w:i w:val="0"/>
           <w:sz w:val="24"/>
         </w:rPr>
-        <w:t>Os dois modelos pedidos ficam tecnicamente empatados na ordenação dos clientes: ROC-AUC de 0,749 da Regressão Logística e 0,746 do KNN (Figura 10). Para saber se a diferença cabe no ruído, o grupo reamostra os 676 clientes de teste 2.000 vezes pelo método bootstrap (EFRON; TIBSHIRANI, 1993) e recalcula a diferença de AUC em cada reamostragem: o intervalo de 95% vai de -0,006 a 0,012 e contém o zero. Nas métricas de decisão, a Regressão Logística tem a melhor acurácia (0,683), precisão (0,793), especificidade (0,790) e F1-macro (0,683), com o menor recall dos três (0,604). As matrizes de confusão (Figura 11) mostram o mesmo padrão: a Logística erra menos entre os que não recompram (61 falsos positivos, contra 72 do KNN e 75 do RFM manual).</w:t>
+        <w:t>Os dois modelos pedidos ficam tecnicamente empatados na ordenação dos clientes: ROC-AUC de 0,749 da Regressão Logística e 0,746 do KNN (Figura 10). Para saber se a diferença cabe no ruído, o grupo reamostra os 676 clientes de teste 2.000 vezes pelo método bootstrap (EFRON; TIBSHIRANI, 1993) e recalcula a diferença de AUC em cada reamostragem: o intervalo de 95% vai de -0,006 a 0,012 e contém o zero. Nas métricas de decisão, a Regressão Logística tem a melhor acurácia (0,683), precisão (0,793), especificidade (0,790) e F1-macro (0,683), com o menor recall dos três (0,604). As matrizes de confusão (Figura 12) mostram o mesmo padrão: a Logística erra menos entre os que não recompram (61 falsos positivos, contra 72 do KNN e 75 do RFM manual).</w:t>
       </w:r>
     </w:p>
     <w:p>
@@ -5554,7 +5776,7 @@
           <w:i w:val="0"/>
           <w:sz w:val="24"/>
         </w:rPr>
-        <w:t>O resultado mais relevante é a comparação com o RFM manual. Na validação cruzada, o escore por quintis chega a uma AUC de 0,745, praticamente igual à da Logística (0,746) e do KNN (0,749). No teste, a Logística supera o RFM por 0,013 de AUC, com intervalo de 95% entre 0,0004 e 0,024, quase encostando no zero. A ROC-AUC de 0,749 também fica no mesmo patamar do melhor modelo de Ozturk (2026), 0,750, com o mesmo dataset e um horizonte parecido (90 dias no artigo, 94 dias aqui). Todos os métodos esbarram em um teto por volta de 0,75, o que indica que o limite está nas informações disponíveis, e não no algoritmo. O ganho do Machine Learning neste problema não é acertar muito mais do que o método manual: é entregar uma probabilidade por cliente, que permite escolher o limiar pelo custo da campanha, e incorporar variáveis que o RFM não usa.</w:t>
+        <w:t>O resultado mais relevante é a comparação com o RFM manual. Na validação cruzada, o escore por quintis chega a uma AUC de 0,745, praticamente igual à da Logística (0,746) e do KNN (0,749). No teste, a Logística supera o RFM por 0,013 de AUC, com intervalo de 95% entre 0,0004 e 0,024, quase encostando no zero. A ROC-AUC de 0,749 também fica no mesmo patamar do melhor modelo de Ozturk (2026), 0,750, com o mesmo dataset e um horizonte parecido (90 dias no artigo, 94 dias aqui). A PR-AUC conta a mesma história (Figura 11): 0,823 da Logística, 0,817 do KNN e 0,798 do RFM manual, contra 0,571 sem ordenação. O valor da Logística praticamente coincide com a PR-AUC de 0,821 do melhor modelo de Ozturk (2026), com a ressalva de que essa métrica depende da proporção de recompradores de cada estudo. Todos os métodos esbarram em um teto por volta de 0,75 de ROC-AUC, o que indica que o limite está nas informações disponíveis, e não no algoritmo. O ganho do Machine Learning neste problema não é acertar muito mais do que o método manual: é entregar uma probabilidade por cliente, que permite escolher o limiar pelo custo da campanha, e incorporar variáveis que o RFM não usa.</w:t>
       </w:r>
     </w:p>
     <w:p>
@@ -5584,7 +5806,7 @@
           <w:i w:val="0"/>
           <w:sz w:val="24"/>
         </w:rPr>
-        <w:t>Interpretação da Regressão Logística (Figura 12): com as variáveis padronizadas, cada coeficiente é o efeito de um desvio-padrão a mais no log das chances de recompra, e o exponencial do coeficiente é a razão de chances. Frequência (razão de chances de 1,57) e Recência (0,73: quanto mais tempo sem comprar, menor a chance) são as variáveis mais fortes, seguidas de Itens Distintos (1,27) e Monetário (1,20). O resultado converge com a hipótese dos modelos Pareto/NBD e BG/NBD, que usam só recência e frequência para estimar se o cliente continua ativo. O Ticket Médio aparece com efeito levemente negativo (0,94), mas ele é o Monetário dividido pela Frequência, e com variáveis correlacionadas esse sinal pequeno não deve ser interpretado isoladamente. Como o C escolhido impõe regularização forte, os coeficientes estão encolhidos: valem mais o sinal e a ordem de grandeza do que o valor exato. Os coeficientes indicam associação, não causa.</w:t>
+        <w:t>Limiar pelo custo do erro: a acurácia balanceada trata um falso positivo e um falso negativo como erros de mesmo peso. Numa campanha, eles custam diferente: contatar quem não ia voltar desperdiça o custo do contato, e deixar de fora quem ia voltar perde o retorno que essa compra traria. Como o dataset não traz custo de campanha nem margem, o grupo monta um cenário com premissas explícitas. Cada cliente contatado que recompra gera um retorno de £25, cerca de 10% de margem sobre um pedido típico (a mediana do ticket médio no histórico é de £228). O custo por contato varia em três níveis: £5,00 (e-mail com cupom), £12,50 (catálogo impresso) e £17,50 (contato comercial). O lucro da campanha é o retorno dos verdadeiros positivos menos o custo de todos os contatados, 25 × VP − custo × (VP + FP). Pela regra de Bult e Wansbeek (1995), vale contatar quando a probabilidade de recompra passa da razão custo/retorno, então o limiar esperado é 0,20, 0,50 e 0,70 nos três cenários. O limiar de cada método é o de maior lucro nas previsões de validação cruzada do treino, com a mesma regra para a nota de corte do RFM manual, e só depois é aplicado ao teste.</w:t>
       </w:r>
     </w:p>
     <w:p>
@@ -5599,7 +5821,620 @@
           <w:b/>
           <w:sz w:val="20"/>
         </w:rPr>
-        <w:t>Figura 12 - Coeficientes padronizados da Regressão Logística e razão de chances</w:t>
+        <w:t>Figura 13 - Lucro da campanha em três cenários de custo por contato: curva por limiar na validação e resultado no teste</w:t>
+      </w:r>
+    </w:p>
+    <w:p>
+      <w:pPr>
+        <w:keepNext/>
+        <w:jc w:val="center"/>
+      </w:pPr>
+      <w:r>
+        <w:drawing>
+          <wp:inline xmlns:a="http://schemas.openxmlformats.org/drawingml/2006/main" xmlns:pic="http://schemas.openxmlformats.org/drawingml/2006/picture">
+            <wp:extent cx="5760000" cy="2304000"/>
+            <wp:docPr id="13" name="Picture 13"/>
+            <wp:cNvGraphicFramePr>
+              <a:graphicFrameLocks noChangeAspect="1"/>
+            </wp:cNvGraphicFramePr>
+            <a:graphic>
+              <a:graphicData uri="http://schemas.openxmlformats.org/drawingml/2006/picture">
+                <pic:pic>
+                  <pic:nvPicPr>
+                    <pic:cNvPr id="0" name="classificacao_lucro.png"/>
+                    <pic:cNvPicPr/>
+                  </pic:nvPicPr>
+                  <pic:blipFill>
+                    <a:blip r:embed="rId22"/>
+                    <a:stretch>
+                      <a:fillRect/>
+                    </a:stretch>
+                  </pic:blipFill>
+                  <pic:spPr>
+                    <a:xfrm>
+                      <a:off x="0" y="0"/>
+                      <a:ext cx="5760000" cy="2304000"/>
+                    </a:xfrm>
+                    <a:prstGeom prst="rect"/>
+                  </pic:spPr>
+                </pic:pic>
+              </a:graphicData>
+            </a:graphic>
+          </wp:inline>
+        </w:drawing>
+      </w:r>
+    </w:p>
+    <w:p>
+      <w:pPr>
+        <w:spacing w:line="240" w:lineRule="auto" w:before="40" w:after="240"/>
+        <w:jc w:val="center"/>
+      </w:pPr>
+      <w:r>
+        <w:rPr>
+          <w:rFonts w:ascii="Times New Roman" w:hAnsi="Times New Roman"/>
+          <w:sz w:val="20"/>
+        </w:rPr>
+        <w:t>Fonte: Elaborado pelos autores (2026).</w:t>
+      </w:r>
+    </w:p>
+    <w:p>
+      <w:pPr>
+        <w:keepNext/>
+        <w:spacing w:line="240" w:lineRule="auto" w:before="120" w:after="80"/>
+        <w:jc w:val="center"/>
+      </w:pPr>
+      <w:r>
+        <w:rPr>
+          <w:rFonts w:ascii="Times New Roman" w:hAnsi="Times New Roman"/>
+          <w:b/>
+          <w:sz w:val="20"/>
+        </w:rPr>
+        <w:t>Tabela 8 - Lucro da campanha no teste por estratégia (entre parênteses, clientes contatados)</w:t>
+      </w:r>
+    </w:p>
+    <w:tbl>
+      <w:tblPr>
+        <w:tblStyle w:val="LightGrid-Accent1"/>
+        <w:tblW w:type="auto" w:w="0"/>
+        <w:jc w:val="center"/>
+        <w:tblLook w:firstColumn="1" w:firstRow="1" w:lastColumn="0" w:lastRow="0" w:noHBand="0" w:noVBand="1" w:val="04A0"/>
+      </w:tblPr>
+      <w:tblGrid>
+        <w:gridCol w:w="2351"/>
+        <w:gridCol w:w="2351"/>
+        <w:gridCol w:w="2351"/>
+        <w:gridCol w:w="2351"/>
+      </w:tblGrid>
+      <w:tr>
+        <w:trPr>
+          <w:cantSplit/>
+        </w:trPr>
+        <w:tc>
+          <w:tcPr>
+            <w:tcW w:type="dxa" w:w="2351"/>
+            <w:vAlign w:val="center"/>
+          </w:tcPr>
+          <w:p>
+            <w:pPr>
+              <w:keepNext/>
+            </w:pPr>
+            <w:r/>
+            <w:r>
+              <w:rPr>
+                <w:rFonts w:ascii="Times New Roman" w:hAnsi="Times New Roman"/>
+                <w:b/>
+                <w:sz w:val="20"/>
+              </w:rPr>
+              <w:t>Estratégia</w:t>
+            </w:r>
+          </w:p>
+        </w:tc>
+        <w:tc>
+          <w:tcPr>
+            <w:tcW w:type="dxa" w:w="2351"/>
+            <w:vAlign w:val="center"/>
+          </w:tcPr>
+          <w:p>
+            <w:pPr>
+              <w:keepNext/>
+            </w:pPr>
+            <w:r/>
+            <w:r>
+              <w:rPr>
+                <w:rFonts w:ascii="Times New Roman" w:hAnsi="Times New Roman"/>
+                <w:b/>
+                <w:sz w:val="20"/>
+              </w:rPr>
+              <w:t>E-mail com cupom (£5,00)</w:t>
+            </w:r>
+          </w:p>
+        </w:tc>
+        <w:tc>
+          <w:tcPr>
+            <w:tcW w:type="dxa" w:w="2351"/>
+            <w:vAlign w:val="center"/>
+          </w:tcPr>
+          <w:p>
+            <w:pPr>
+              <w:keepNext/>
+            </w:pPr>
+            <w:r/>
+            <w:r>
+              <w:rPr>
+                <w:rFonts w:ascii="Times New Roman" w:hAnsi="Times New Roman"/>
+                <w:b/>
+                <w:sz w:val="20"/>
+              </w:rPr>
+              <w:t>Catálogo impresso (£12,50)</w:t>
+            </w:r>
+          </w:p>
+        </w:tc>
+        <w:tc>
+          <w:tcPr>
+            <w:tcW w:type="dxa" w:w="2351"/>
+            <w:vAlign w:val="center"/>
+          </w:tcPr>
+          <w:p>
+            <w:pPr>
+              <w:keepNext/>
+            </w:pPr>
+            <w:r/>
+            <w:r>
+              <w:rPr>
+                <w:rFonts w:ascii="Times New Roman" w:hAnsi="Times New Roman"/>
+                <w:b/>
+                <w:sz w:val="20"/>
+              </w:rPr>
+              <w:t>Contato comercial (£17,50)</w:t>
+            </w:r>
+          </w:p>
+        </w:tc>
+      </w:tr>
+      <w:tr>
+        <w:trPr>
+          <w:cantSplit/>
+        </w:trPr>
+        <w:tc>
+          <w:tcPr>
+            <w:tcW w:type="dxa" w:w="2351"/>
+          </w:tcPr>
+          <w:p>
+            <w:pPr>
+              <w:keepNext/>
+            </w:pPr>
+            <w:r/>
+            <w:r>
+              <w:rPr>
+                <w:rFonts w:ascii="Times New Roman" w:hAnsi="Times New Roman"/>
+                <w:sz w:val="20"/>
+              </w:rPr>
+              <w:t>Contatar todos</w:t>
+            </w:r>
+          </w:p>
+        </w:tc>
+        <w:tc>
+          <w:tcPr>
+            <w:tcW w:type="dxa" w:w="2351"/>
+          </w:tcPr>
+          <w:p>
+            <w:pPr>
+              <w:keepNext/>
+            </w:pPr>
+            <w:r/>
+            <w:r>
+              <w:rPr>
+                <w:rFonts w:ascii="Times New Roman" w:hAnsi="Times New Roman"/>
+                <w:sz w:val="20"/>
+              </w:rPr>
+              <w:t>£6.270 (100%)</w:t>
+            </w:r>
+          </w:p>
+        </w:tc>
+        <w:tc>
+          <w:tcPr>
+            <w:tcW w:type="dxa" w:w="2351"/>
+          </w:tcPr>
+          <w:p>
+            <w:pPr>
+              <w:keepNext/>
+            </w:pPr>
+            <w:r/>
+            <w:r>
+              <w:rPr>
+                <w:rFonts w:ascii="Times New Roman" w:hAnsi="Times New Roman"/>
+                <w:sz w:val="20"/>
+              </w:rPr>
+              <w:t>£1.200 (100%)</w:t>
+            </w:r>
+          </w:p>
+        </w:tc>
+        <w:tc>
+          <w:tcPr>
+            <w:tcW w:type="dxa" w:w="2351"/>
+          </w:tcPr>
+          <w:p>
+            <w:pPr>
+              <w:keepNext/>
+            </w:pPr>
+            <w:r/>
+            <w:r>
+              <w:rPr>
+                <w:rFonts w:ascii="Times New Roman" w:hAnsi="Times New Roman"/>
+                <w:sz w:val="20"/>
+              </w:rPr>
+              <w:t>−£2.180 (100%)</w:t>
+            </w:r>
+          </w:p>
+        </w:tc>
+      </w:tr>
+      <w:tr>
+        <w:trPr>
+          <w:cantSplit/>
+        </w:trPr>
+        <w:tc>
+          <w:tcPr>
+            <w:tcW w:type="dxa" w:w="2351"/>
+          </w:tcPr>
+          <w:p>
+            <w:pPr>
+              <w:keepNext/>
+            </w:pPr>
+            <w:r/>
+            <w:r>
+              <w:rPr>
+                <w:rFonts w:ascii="Times New Roman" w:hAnsi="Times New Roman"/>
+                <w:sz w:val="20"/>
+              </w:rPr>
+              <w:t>RFM manual</w:t>
+            </w:r>
+          </w:p>
+        </w:tc>
+        <w:tc>
+          <w:tcPr>
+            <w:tcW w:type="dxa" w:w="2351"/>
+          </w:tcPr>
+          <w:p>
+            <w:pPr>
+              <w:keepNext/>
+            </w:pPr>
+            <w:r/>
+            <w:r>
+              <w:rPr>
+                <w:rFonts w:ascii="Times New Roman" w:hAnsi="Times New Roman"/>
+                <w:sz w:val="20"/>
+              </w:rPr>
+              <w:t>£6.270 (100%)</w:t>
+            </w:r>
+          </w:p>
+        </w:tc>
+        <w:tc>
+          <w:tcPr>
+            <w:tcW w:type="dxa" w:w="2351"/>
+          </w:tcPr>
+          <w:p>
+            <w:pPr>
+              <w:keepNext/>
+            </w:pPr>
+            <w:r/>
+            <w:r>
+              <w:rPr>
+                <w:rFonts w:ascii="Times New Roman" w:hAnsi="Times New Roman"/>
+                <w:sz w:val="20"/>
+              </w:rPr>
+              <w:t>£2.038 (55%)</w:t>
+            </w:r>
+          </w:p>
+        </w:tc>
+        <w:tc>
+          <w:tcPr>
+            <w:tcW w:type="dxa" w:w="2351"/>
+          </w:tcPr>
+          <w:p>
+            <w:pPr>
+              <w:keepNext/>
+            </w:pPr>
+            <w:r/>
+            <w:r>
+              <w:rPr>
+                <w:rFonts w:ascii="Times New Roman" w:hAnsi="Times New Roman"/>
+                <w:sz w:val="20"/>
+              </w:rPr>
+              <w:t>£725 (33%)</w:t>
+            </w:r>
+          </w:p>
+        </w:tc>
+      </w:tr>
+      <w:tr>
+        <w:trPr>
+          <w:cantSplit/>
+        </w:trPr>
+        <w:tc>
+          <w:tcPr>
+            <w:tcW w:type="dxa" w:w="2351"/>
+          </w:tcPr>
+          <w:p>
+            <w:pPr>
+              <w:keepNext/>
+            </w:pPr>
+            <w:r/>
+            <w:r>
+              <w:rPr>
+                <w:rFonts w:ascii="Times New Roman" w:hAnsi="Times New Roman"/>
+                <w:sz w:val="20"/>
+              </w:rPr>
+              <w:t>Modelo C (Logística)</w:t>
+            </w:r>
+          </w:p>
+        </w:tc>
+        <w:tc>
+          <w:tcPr>
+            <w:tcW w:type="dxa" w:w="2351"/>
+          </w:tcPr>
+          <w:p>
+            <w:pPr>
+              <w:keepNext/>
+            </w:pPr>
+            <w:r/>
+            <w:r>
+              <w:rPr>
+                <w:rFonts w:ascii="Times New Roman" w:hAnsi="Times New Roman"/>
+                <w:sz w:val="20"/>
+              </w:rPr>
+              <w:t>£6.280 (100%)</w:t>
+            </w:r>
+          </w:p>
+        </w:tc>
+        <w:tc>
+          <w:tcPr>
+            <w:tcW w:type="dxa" w:w="2351"/>
+          </w:tcPr>
+          <w:p>
+            <w:pPr>
+              <w:keepNext/>
+            </w:pPr>
+            <w:r/>
+            <w:r>
+              <w:rPr>
+                <w:rFonts w:ascii="Times New Roman" w:hAnsi="Times New Roman"/>
+                <w:sz w:val="20"/>
+              </w:rPr>
+              <w:t>£2.100 (55%)</w:t>
+            </w:r>
+          </w:p>
+        </w:tc>
+        <w:tc>
+          <w:tcPr>
+            <w:tcW w:type="dxa" w:w="2351"/>
+          </w:tcPr>
+          <w:p>
+            <w:pPr>
+              <w:keepNext/>
+            </w:pPr>
+            <w:r/>
+            <w:r>
+              <w:rPr>
+                <w:rFonts w:ascii="Times New Roman" w:hAnsi="Times New Roman"/>
+                <w:sz w:val="20"/>
+              </w:rPr>
+              <w:t>£830 (32%)</w:t>
+            </w:r>
+          </w:p>
+        </w:tc>
+      </w:tr>
+      <w:tr>
+        <w:trPr>
+          <w:cantSplit/>
+        </w:trPr>
+        <w:tc>
+          <w:tcPr>
+            <w:tcW w:type="dxa" w:w="2351"/>
+          </w:tcPr>
+          <w:p>
+            <w:pPr>
+              <w:keepNext/>
+            </w:pPr>
+            <w:r/>
+            <w:r>
+              <w:rPr>
+                <w:rFonts w:ascii="Times New Roman" w:hAnsi="Times New Roman"/>
+                <w:sz w:val="20"/>
+              </w:rPr>
+              <w:t>Modelo D (KNN)</w:t>
+            </w:r>
+          </w:p>
+        </w:tc>
+        <w:tc>
+          <w:tcPr>
+            <w:tcW w:type="dxa" w:w="2351"/>
+          </w:tcPr>
+          <w:p>
+            <w:pPr>
+              <w:keepNext/>
+            </w:pPr>
+            <w:r/>
+            <w:r>
+              <w:rPr>
+                <w:rFonts w:ascii="Times New Roman" w:hAnsi="Times New Roman"/>
+                <w:sz w:val="20"/>
+              </w:rPr>
+              <w:t>£6.265 (99%)</w:t>
+            </w:r>
+          </w:p>
+        </w:tc>
+        <w:tc>
+          <w:tcPr>
+            <w:tcW w:type="dxa" w:w="2351"/>
+          </w:tcPr>
+          <w:p>
+            <w:pPr>
+              <w:keepNext/>
+            </w:pPr>
+            <w:r/>
+            <w:r>
+              <w:rPr>
+                <w:rFonts w:ascii="Times New Roman" w:hAnsi="Times New Roman"/>
+                <w:sz w:val="20"/>
+              </w:rPr>
+              <w:t>£2.050 (59%)</w:t>
+            </w:r>
+          </w:p>
+        </w:tc>
+        <w:tc>
+          <w:tcPr>
+            <w:tcW w:type="dxa" w:w="2351"/>
+          </w:tcPr>
+          <w:p>
+            <w:pPr>
+              <w:keepNext/>
+            </w:pPr>
+            <w:r/>
+            <w:r>
+              <w:rPr>
+                <w:rFonts w:ascii="Times New Roman" w:hAnsi="Times New Roman"/>
+                <w:sz w:val="20"/>
+              </w:rPr>
+              <w:t>£785 (32%)</w:t>
+            </w:r>
+          </w:p>
+        </w:tc>
+      </w:tr>
+      <w:tr>
+        <w:trPr>
+          <w:cantSplit/>
+        </w:trPr>
+        <w:tc>
+          <w:tcPr>
+            <w:tcW w:type="dxa" w:w="2351"/>
+          </w:tcPr>
+          <w:p>
+            <w:r/>
+            <w:r>
+              <w:rPr>
+                <w:rFonts w:ascii="Times New Roman" w:hAnsi="Times New Roman"/>
+                <w:sz w:val="20"/>
+              </w:rPr>
+              <w:t>Teto: só quem recomprou</w:t>
+            </w:r>
+          </w:p>
+        </w:tc>
+        <w:tc>
+          <w:tcPr>
+            <w:tcW w:type="dxa" w:w="2351"/>
+          </w:tcPr>
+          <w:p>
+            <w:r/>
+            <w:r>
+              <w:rPr>
+                <w:rFonts w:ascii="Times New Roman" w:hAnsi="Times New Roman"/>
+                <w:sz w:val="20"/>
+              </w:rPr>
+              <w:t>£7.720</w:t>
+            </w:r>
+          </w:p>
+        </w:tc>
+        <w:tc>
+          <w:tcPr>
+            <w:tcW w:type="dxa" w:w="2351"/>
+          </w:tcPr>
+          <w:p>
+            <w:r/>
+            <w:r>
+              <w:rPr>
+                <w:rFonts w:ascii="Times New Roman" w:hAnsi="Times New Roman"/>
+                <w:sz w:val="20"/>
+              </w:rPr>
+              <w:t>£4.825</w:t>
+            </w:r>
+          </w:p>
+        </w:tc>
+        <w:tc>
+          <w:tcPr>
+            <w:tcW w:type="dxa" w:w="2351"/>
+          </w:tcPr>
+          <w:p>
+            <w:r/>
+            <w:r>
+              <w:rPr>
+                <w:rFonts w:ascii="Times New Roman" w:hAnsi="Times New Roman"/>
+                <w:sz w:val="20"/>
+              </w:rPr>
+              <w:t>£2.895</w:t>
+            </w:r>
+          </w:p>
+        </w:tc>
+      </w:tr>
+    </w:tbl>
+    <w:p>
+      <w:pPr>
+        <w:spacing w:line="240" w:lineRule="auto" w:before="40" w:after="240"/>
+        <w:jc w:val="center"/>
+      </w:pPr>
+      <w:r>
+        <w:rPr>
+          <w:rFonts w:ascii="Times New Roman" w:hAnsi="Times New Roman"/>
+          <w:sz w:val="20"/>
+        </w:rPr>
+        <w:t>Fonte: Elaborado pelos autores (2026).</w:t>
+      </w:r>
+    </w:p>
+    <w:p>
+      <w:pPr>
+        <w:spacing w:line="360" w:lineRule="auto" w:after="120"/>
+        <w:jc w:val="both"/>
+      </w:pPr>
+      <w:r>
+        <w:rPr>
+          <w:rFonts w:ascii="Times New Roman" w:hAnsi="Times New Roman"/>
+          <w:b w:val="0"/>
+          <w:i w:val="0"/>
+          <w:sz w:val="24"/>
+        </w:rPr>
+        <w:t>Os limiares escolhidos para a Logística (0,15, 0,53 e 0,68) ficaram perto dos valores teóricos, sinal de que as probabilidades do modelo estão bem calibradas no período de treino. No cenário barato, a curva é plana para qualquer limiar baixo, e a diferença entre 0,15 e 0,20 não muda a decisão. A Figura 13 e a Tabela 8 mostram três situações diferentes. Com o e-mail com cupom, a melhor decisão é contatar praticamente todos: os modelos não trazem ganho, e a campanha rende cerca de £6.280 no teste. Com o catálogo impresso, os modelos acionam de 55% a 59% dos clientes e quase dobram o lucro de contatar todos (£2.100 da Logística contra £1.200). Com o contato comercial, contatar todos dá prejuízo de £2.180, enquanto a Logística aciona 32% dos clientes, alcança 47% dos que recompraram e lucra £830.</w:t>
+      </w:r>
+    </w:p>
+    <w:p>
+      <w:pPr>
+        <w:spacing w:line="360" w:lineRule="auto" w:after="120"/>
+        <w:jc w:val="both"/>
+      </w:pPr>
+      <w:r>
+        <w:rPr>
+          <w:rFonts w:ascii="Times New Roman" w:hAnsi="Times New Roman"/>
+          <w:b w:val="0"/>
+          <w:i w:val="0"/>
+          <w:sz w:val="24"/>
+        </w:rPr>
+        <w:t>Contra o RFM manual, a Logística lucra £62 a mais no cenário do catálogo impresso e £105 a mais no do contato comercial, mas os intervalos de 95% por bootstrap (de −£100 a £225 e de −£40 a £258) contêm o zero. O cenário confirma a leitura da ROC-AUC: o grande ganho vem de sair do "contatar todos" e escolher o corte pelo custo, algo que qualquer escore ordenado permite. A vantagem prática da Logística é que a sua saída é uma probabilidade, então o limiar ideal é conhecido de antemão (custo dividido pelo retorno), enquanto a nota de 3 a 15 do RFM não tem esse significado e o corte precisa ser testado. Os valores de retorno e custo são hipotéticos, e o retorno real de uma campanha só se mede com um grupo de controle (teste A/B), porque parte dos clientes contatados compraria de qualquer jeito.</w:t>
+      </w:r>
+    </w:p>
+    <w:p>
+      <w:pPr>
+        <w:spacing w:line="360" w:lineRule="auto" w:after="120"/>
+        <w:jc w:val="both"/>
+      </w:pPr>
+      <w:r>
+        <w:rPr>
+          <w:rFonts w:ascii="Times New Roman" w:hAnsi="Times New Roman"/>
+          <w:b w:val="0"/>
+          <w:i w:val="0"/>
+          <w:sz w:val="24"/>
+        </w:rPr>
+        <w:t>Interpretação da Regressão Logística (Figura 14): com as variáveis padronizadas, cada coeficiente é o efeito de um desvio-padrão a mais no log das chances de recompra, e o exponencial do coeficiente é a razão de chances. Frequência (razão de chances de 1,57) e Recência (0,73: quanto mais tempo sem comprar, menor a chance) são as variáveis mais fortes, seguidas de Itens Distintos (1,27) e Monetário (1,20). O resultado converge com a hipótese dos modelos Pareto/NBD e BG/NBD, que usam só recência e frequência para estimar se o cliente continua ativo. O Ticket Médio aparece com efeito levemente negativo (0,94), mas ele é o Monetário dividido pela Frequência, e com variáveis correlacionadas esse sinal pequeno não deve ser interpretado isoladamente. Como o C escolhido impõe regularização forte, os coeficientes estão encolhidos: valem mais o sinal e a ordem de grandeza do que o valor exato. Os coeficientes indicam associação, não causa.</w:t>
+      </w:r>
+    </w:p>
+    <w:p>
+      <w:pPr>
+        <w:keepNext/>
+        <w:spacing w:line="240" w:lineRule="auto" w:before="120" w:after="80"/>
+        <w:jc w:val="center"/>
+      </w:pPr>
+      <w:r>
+        <w:rPr>
+          <w:rFonts w:ascii="Times New Roman" w:hAnsi="Times New Roman"/>
+          <w:b/>
+          <w:sz w:val="20"/>
+        </w:rPr>
+        <w:t>Figura 14 - Coeficientes padronizados da Regressão Logística e razão de chances</w:t>
       </w:r>
     </w:p>
     <w:p>
@@ -5611,7 +6446,7 @@
         <w:drawing>
           <wp:inline xmlns:a="http://schemas.openxmlformats.org/drawingml/2006/main" xmlns:pic="http://schemas.openxmlformats.org/drawingml/2006/picture">
             <wp:extent cx="4860000" cy="2592000"/>
-            <wp:docPr id="12" name="Picture 12"/>
+            <wp:docPr id="14" name="Picture 14"/>
             <wp:cNvGraphicFramePr>
               <a:graphicFrameLocks noChangeAspect="1"/>
             </wp:cNvGraphicFramePr>
@@ -5623,7 +6458,7 @@
                     <pic:cNvPicPr/>
                   </pic:nvPicPr>
                   <pic:blipFill>
-                    <a:blip r:embed="rId21"/>
+                    <a:blip r:embed="rId23"/>
                     <a:stretch>
                       <a:fillRect/>
                     </a:stretch>
@@ -5667,7 +6502,7 @@
           <w:i w:val="0"/>
           <w:sz w:val="24"/>
         </w:rPr>
-        <w:t>Auditoria de uma decisão do KNN: em vez de parar na previsão, o grupo examina os vizinhos de um cliente típico do teste, o mais próximo da mediana de todas as features: 2 notas fiscais, £486,82 gastos e última compra 56 dias antes do corte. Dos 301 vizinhos, 57,1% recompraram (probabilidade de 0,571), pouco abaixo do limiar de 0,58, e o modelo prevê que o cliente não volta, o que se confirmou. Os cinco vizinhos mais próximos (Tabela 8) têm quase o mesmo perfil e se dividem: 3 recompraram e 2 não. O caso mostra por que a AUC não passa de 0,75: com só essas seis variáveis, clientes quase idênticos tomam decisões diferentes.</w:t>
+        <w:t>Auditoria de uma decisão do KNN: em vez de parar na previsão, o grupo examina os vizinhos de um cliente típico do teste, o mais próximo da mediana de todas as features: 2 notas fiscais, £486,82 gastos e última compra 56 dias antes do corte. Dos 301 vizinhos, 57,1% recompraram (probabilidade de 0,571), pouco abaixo do limiar de 0,58, e o modelo prevê que o cliente não volta, o que se confirmou. Os cinco vizinhos mais próximos (Tabela 9) têm quase o mesmo perfil e se dividem: 3 recompraram e 2 não. O caso mostra por que a AUC não passa de 0,75: com só essas seis variáveis, clientes quase idênticos tomam decisões diferentes.</w:t>
       </w:r>
     </w:p>
     <w:p>
@@ -5682,7 +6517,7 @@
           <w:b/>
           <w:sz w:val="20"/>
         </w:rPr>
-        <w:t>Tabela 8 - Os cinco vizinhos mais próximos de um cliente típico do teste no KNN</w:t>
+        <w:t>Tabela 9 - Os cinco vizinhos mais próximos de um cliente típico do teste no KNN</w:t>
       </w:r>
     </w:p>
     <w:tbl>
@@ -6506,7 +7341,7 @@
           <w:i w:val="0"/>
           <w:sz w:val="24"/>
         </w:rPr>
-        <w:t>Validação temporal: na prática, o modelo é treinado com o que já aconteceu e usado no período seguinte. Para simular esse uso, o grupo recua o corte em um horizonte inteiro (94 dias): as features vão até 04/06/2011 e o alvo cobre o período entre 04/06/2011 e 06/09/2011. Os modelos são reajustados só nessa base antiga (2.785 clientes), com a mesma grade, validação cruzada e regra de limiar, e testados nos 3.377 clientes da base atual (Tabela 9).</w:t>
+        <w:t>Validação temporal: na prática, o modelo é treinado com o que já aconteceu e usado no período seguinte. Para simular esse uso, o grupo recua o corte em um horizonte inteiro (94 dias): as features vão até 04/06/2011 e o alvo cobre o período entre 04/06/2011 e 06/09/2011. Os modelos são reajustados só nessa base antiga (2.785 clientes), com a mesma grade, validação cruzada e regra de limiar, e testados nos 3.377 clientes da base atual (Tabela 10).</w:t>
       </w:r>
     </w:p>
     <w:p>
@@ -6521,7 +7356,7 @@
           <w:b/>
           <w:sz w:val="20"/>
         </w:rPr>
-        <w:t>Tabela 9 - Validação temporal: modelos treinados no trimestre anterior e testados no trimestre seguinte</w:t>
+        <w:t>Tabela 10 - Validação temporal: modelos treinados no trimestre anterior e testados no trimestre seguinte</w:t>
       </w:r>
     </w:p>
     <w:tbl>
@@ -7141,7 +7976,7 @@
           <w:i w:val="0"/>
           <w:sz w:val="24"/>
         </w:rPr>
-        <w:t>O resultado central do trabalho é a proximidade com o método manual: o RFM por quintis chega muito perto dos modelos, e o teto de ROC-AUC em torno de 0,75 aparece em todos os métodos, inclusive na literatura com o mesmo dataset. Mais algoritmo não resolve; o próximo ganho viria de novas variáveis. Recomendação prática para o varejista: ordenar a base pela probabilidade de recompra da Regressão Logística e escolher o limiar pelo custo da ação. Para uma ação barata, como um e-mail, um limiar baixo alcança quase todos os recompradores; para uma ação cara, como um cupom ou o contato de um vendedor, um limiar alto concentra o investimento. Com limiar de 0,70, por exemplo, 85% dos clientes acionados recompram, contra 58% na base toda, alcançando 30% dos clientes. O modelo deve ser recalibrado a cada trimestre, porque a taxa de recompra muda com a sazonalidade.</w:t>
+        <w:t>O resultado central do trabalho é a proximidade com o método manual: o RFM por quintis chega muito perto dos modelos, e o teto de ROC-AUC em torno de 0,75 aparece em todos os métodos, inclusive na literatura com o mesmo dataset. Mais algoritmo não resolve; o próximo ganho viria de novas variáveis. Recomendação prática para o varejista: ordenar a base pela probabilidade de recompra da Regressão Logística e acionar quem tem probabilidade acima da razão entre o custo do contato e o retorno esperado. No cenário simulado, uma ação barata, como um e-mail com cupom, compensa para praticamente toda a base; uma ação cara, como o contato de um vendedor, dá prejuízo de £2.180 se feita para todos e lucro de £830 quando restrita aos 32% de clientes com probabilidade acima de 0,68. O modelo deve ser recalibrado a cada trimestre, porque a taxa de recompra muda com a sazonalidade, e o limiar ideal só vale enquanto as probabilidades estiverem calibradas.</w:t>
       </w:r>
     </w:p>
     <w:p>
@@ -7156,7 +7991,7 @@
           <w:i w:val="0"/>
           <w:sz w:val="24"/>
         </w:rPr>
-        <w:t>Limitações: o dataset cobre um único varejista do Reino Unido durante um ano; um quarto das transações não tem identificação de cliente e fica fora da análise; a Frequência conta também notas fiscais de cancelamento; o limiar de decisão foi escolhido por um critério neutro, sem os custos reais das campanhas; e as seis variáveis RFM não capturam sazonalidade, categoria de produto nem canal de venda. O projeto aplica, com dados reais, o pipeline completo de pré-processamento, engenharia de atributos com controle de data leakage e comparação de modelos ensinado até a Aula 8 da disciplina. Como próximos passos, o grupo pretende segmentar os clientes com K-Means sobre as mesmas variáveis RFM, quando o conteúdo for apresentado em aula, e testar novas variáveis, como intervalo médio entre compras, país e categoria dos produtos.</w:t>
+        <w:t>Limitações: o dataset cobre um único varejista do Reino Unido durante um ano; um quarto das transações não tem identificação de cliente e fica fora da análise; a Frequência conta também notas fiscais de cancelamento; o cenário de lucro usa custo e retorno hipotéticos, e o efeito real de uma campanha só se mede com grupo de controle; e as seis variáveis RFM não capturam sazonalidade, categoria de produto nem canal de venda. O projeto aplica, com dados reais, o pipeline completo de pré-processamento, engenharia de atributos com controle de data leakage e comparação de modelos ensinado até a Aula 8 da disciplina. Como próximos passos, o grupo pretende segmentar os clientes com K-Means sobre as mesmas variáveis RFM, quando o conteúdo for apresentado em aula, e testar novas variáveis, como intervalo médio entre compras, país e categoria dos produtos.</w:t>
       </w:r>
     </w:p>
     <w:p>
@@ -7243,7 +8078,7 @@
           <w:b/>
           <w:sz w:val="20"/>
         </w:rPr>
-        <w:t>Tabela 10 - Cronograma do projeto</w:t>
+        <w:t>Tabela 11 - Cronograma do projeto</w:t>
       </w:r>
     </w:p>
     <w:tbl>
@@ -7580,6 +8415,36 @@
           <w:b w:val="0"/>
           <w:sz w:val="24"/>
         </w:rPr>
+        <w:t xml:space="preserve">BULT, J. R.; WANSBEEK, T. Optimal selection for direct mail. </w:t>
+      </w:r>
+      <w:r>
+        <w:rPr>
+          <w:rFonts w:ascii="Times New Roman" w:hAnsi="Times New Roman"/>
+          <w:b/>
+          <w:sz w:val="24"/>
+        </w:rPr>
+        <w:t>Marketing Science</w:t>
+      </w:r>
+      <w:r>
+        <w:rPr>
+          <w:rFonts w:ascii="Times New Roman" w:hAnsi="Times New Roman"/>
+          <w:b w:val="0"/>
+          <w:sz w:val="24"/>
+        </w:rPr>
+        <w:t>, v. 14, n. 4, p. 378-394, 1995.</w:t>
+      </w:r>
+    </w:p>
+    <w:p>
+      <w:pPr>
+        <w:spacing w:line="240" w:lineRule="auto" w:after="240"/>
+        <w:jc w:val="left"/>
+      </w:pPr>
+      <w:r>
+        <w:rPr>
+          <w:rFonts w:ascii="Times New Roman" w:hAnsi="Times New Roman"/>
+          <w:b w:val="0"/>
+          <w:sz w:val="24"/>
+        </w:rPr>
         <w:t xml:space="preserve">CHEN, D. </w:t>
       </w:r>
       <w:r>
@@ -7640,6 +8505,36 @@
           <w:b w:val="0"/>
           <w:sz w:val="24"/>
         </w:rPr>
+        <w:t xml:space="preserve">CHOU, P. et al. Predictive analytics for customer repurchase: interdisciplinary integration of buy till you die modeling and machine learning. </w:t>
+      </w:r>
+      <w:r>
+        <w:rPr>
+          <w:rFonts w:ascii="Times New Roman" w:hAnsi="Times New Roman"/>
+          <w:b/>
+          <w:sz w:val="24"/>
+        </w:rPr>
+        <w:t>European Journal of Operational Research</w:t>
+      </w:r>
+      <w:r>
+        <w:rPr>
+          <w:rFonts w:ascii="Times New Roman" w:hAnsi="Times New Roman"/>
+          <w:b w:val="0"/>
+          <w:sz w:val="24"/>
+        </w:rPr>
+        <w:t>, v. 296, n. 2, p. 635-651, 2022. DOI: 10.1016/j.ejor.2021.04.021.</w:t>
+      </w:r>
+    </w:p>
+    <w:p>
+      <w:pPr>
+        <w:spacing w:line="240" w:lineRule="auto" w:after="240"/>
+        <w:jc w:val="left"/>
+      </w:pPr>
+      <w:r>
+        <w:rPr>
+          <w:rFonts w:ascii="Times New Roman" w:hAnsi="Times New Roman"/>
+          <w:b w:val="0"/>
+          <w:sz w:val="24"/>
+        </w:rPr>
         <w:t xml:space="preserve">COVER, T. M.; HART, P. E. Nearest neighbor pattern classification. </w:t>
       </w:r>
       <w:r>
@@ -7760,6 +8655,36 @@
           <w:b w:val="0"/>
           <w:sz w:val="24"/>
         </w:rPr>
+        <w:t xml:space="preserve">GOOGLE. </w:t>
+      </w:r>
+      <w:r>
+        <w:rPr>
+          <w:rFonts w:ascii="Times New Roman" w:hAnsi="Times New Roman"/>
+          <w:b/>
+          <w:sz w:val="24"/>
+        </w:rPr>
+        <w:t>[GA4] Predictive metrics</w:t>
+      </w:r>
+      <w:r>
+        <w:rPr>
+          <w:rFonts w:ascii="Times New Roman" w:hAnsi="Times New Roman"/>
+          <w:b w:val="0"/>
+          <w:sz w:val="24"/>
+        </w:rPr>
+        <w:t>. Analytics Help, [2026]. Disponível em: https://support.google.com/analytics/answer/9846734. Acesso em: 30 set. 2026.</w:t>
+      </w:r>
+    </w:p>
+    <w:p>
+      <w:pPr>
+        <w:spacing w:line="240" w:lineRule="auto" w:after="240"/>
+        <w:jc w:val="left"/>
+      </w:pPr>
+      <w:r>
+        <w:rPr>
+          <w:rFonts w:ascii="Times New Roman" w:hAnsi="Times New Roman"/>
+          <w:b w:val="0"/>
+          <w:sz w:val="24"/>
+        </w:rPr>
         <w:t xml:space="preserve">HOSMER, D. W.; LEMESHOW, S.; STURDIVANT, R. X. </w:t>
       </w:r>
       <w:r>
@@ -7850,6 +8775,36 @@
           <w:b w:val="0"/>
           <w:sz w:val="24"/>
         </w:rPr>
+        <w:t xml:space="preserve">LIU, G. et al. Repeat buyer prediction for e-commerce. In: ACM SIGKDD INTERNATIONAL CONFERENCE ON KNOWLEDGE DISCOVERY AND DATA MINING, 22., 2016, San Francisco. </w:t>
+      </w:r>
+      <w:r>
+        <w:rPr>
+          <w:rFonts w:ascii="Times New Roman" w:hAnsi="Times New Roman"/>
+          <w:b/>
+          <w:sz w:val="24"/>
+        </w:rPr>
+        <w:t>Proceedings</w:t>
+      </w:r>
+      <w:r>
+        <w:rPr>
+          <w:rFonts w:ascii="Times New Roman" w:hAnsi="Times New Roman"/>
+          <w:b w:val="0"/>
+          <w:sz w:val="24"/>
+        </w:rPr>
+        <w:t xml:space="preserve"> [...]. New York: ACM, 2016. p. 155-164. DOI: 10.1145/2939672.2939674.</w:t>
+      </w:r>
+    </w:p>
+    <w:p>
+      <w:pPr>
+        <w:spacing w:line="240" w:lineRule="auto" w:after="240"/>
+        <w:jc w:val="left"/>
+      </w:pPr>
+      <w:r>
+        <w:rPr>
+          <w:rFonts w:ascii="Times New Roman" w:hAnsi="Times New Roman"/>
+          <w:b w:val="0"/>
+          <w:sz w:val="24"/>
+        </w:rPr>
         <w:t xml:space="preserve">OZTURK, I. Data-driven customer retention for SMEs: predicting repeat purchase and customer value. </w:t>
       </w:r>
       <w:r>
@@ -8017,6 +8972,36 @@
           <w:sz w:val="24"/>
         </w:rPr>
         <w:t>, v. 37, n. 2, 100574, 2025. DOI: 10.1016/j.iimb.2025.100574.</w:t>
+      </w:r>
+    </w:p>
+    <w:p>
+      <w:pPr>
+        <w:spacing w:line="240" w:lineRule="auto" w:after="240"/>
+        <w:jc w:val="left"/>
+      </w:pPr>
+      <w:r>
+        <w:rPr>
+          <w:rFonts w:ascii="Times New Roman" w:hAnsi="Times New Roman"/>
+          <w:b w:val="0"/>
+          <w:sz w:val="24"/>
+        </w:rPr>
+        <w:t xml:space="preserve">ZAGHLOUL, M.; BARAKAT, S.; REZK, A. Enhancing customer retention in online retail through churn prediction: a hybrid RFM, K-means, and deep neural network approach. </w:t>
+      </w:r>
+      <w:r>
+        <w:rPr>
+          <w:rFonts w:ascii="Times New Roman" w:hAnsi="Times New Roman"/>
+          <w:b/>
+          <w:sz w:val="24"/>
+        </w:rPr>
+        <w:t>Expert Systems with Applications</w:t>
+      </w:r>
+      <w:r>
+        <w:rPr>
+          <w:rFonts w:ascii="Times New Roman" w:hAnsi="Times New Roman"/>
+          <w:b w:val="0"/>
+          <w:sz w:val="24"/>
+        </w:rPr>
+        <w:t>, v. 290, 128465, 2025. DOI: 10.1016/j.eswa.2025.128465.</w:t>
       </w:r>
     </w:p>
     <w:sectPr>

</xml_diff>

<commit_message>
docs: remove proximos passos do README, do relatorio e do notebook
</commit_message>
<xml_diff>
--- a/Projeto_Final_ML_Online_Retail.docx
+++ b/Projeto_Final_ML_Online_Retail.docx
@@ -7976,7 +7976,7 @@
           <w:i w:val="0"/>
           <w:sz w:val="24"/>
         </w:rPr>
-        <w:t>O resultado central do trabalho é a proximidade com o método manual: o RFM por quintis chega muito perto dos modelos, e o teto de ROC-AUC em torno de 0,75 aparece em todos os métodos, inclusive na literatura com o mesmo dataset. Mais algoritmo não resolve; o próximo ganho viria de novas variáveis. Recomendação prática para o varejista: ordenar a base pela probabilidade de recompra da Regressão Logística e acionar quem tem probabilidade acima da razão entre o custo do contato e o retorno esperado. No cenário simulado, uma ação barata, como um e-mail com cupom, compensa para praticamente toda a base; uma ação cara, como o contato de um vendedor, dá prejuízo de £2.180 se feita para todos e lucro de £830 quando restrita aos 32% de clientes com probabilidade acima de 0,68. O modelo deve ser recalibrado a cada trimestre, porque a taxa de recompra muda com a sazonalidade, e o limiar ideal só vale enquanto as probabilidades estiverem calibradas.</w:t>
+        <w:t>O resultado central do trabalho é a proximidade com o método manual: o RFM por quintis chega muito perto dos modelos, e o teto de ROC-AUC em torno de 0,75 aparece em todos os métodos, inclusive na literatura com o mesmo dataset. Mais algoritmo não resolve, porque o limite está nas informações disponíveis. Recomendação prática para o varejista: ordenar a base pela probabilidade de recompra da Regressão Logística e acionar quem tem probabilidade acima da razão entre o custo do contato e o retorno esperado. No cenário simulado, uma ação barata, como um e-mail com cupom, compensa para praticamente toda a base; uma ação cara, como o contato de um vendedor, dá prejuízo de £2.180 se feita para todos e lucro de £830 quando restrita aos 32% de clientes com probabilidade acima de 0,68. O modelo deve ser recalibrado a cada trimestre, porque a taxa de recompra muda com a sazonalidade, e o limiar ideal só vale enquanto as probabilidades estiverem calibradas.</w:t>
       </w:r>
     </w:p>
     <w:p>
@@ -7991,7 +7991,7 @@
           <w:i w:val="0"/>
           <w:sz w:val="24"/>
         </w:rPr>
-        <w:t>Limitações: o dataset cobre um único varejista do Reino Unido durante um ano; um quarto das transações não tem identificação de cliente e fica fora da análise; a Frequência conta também notas fiscais de cancelamento; o cenário de lucro usa custo e retorno hipotéticos, e o efeito real de uma campanha só se mede com grupo de controle; e as seis variáveis RFM não capturam sazonalidade, categoria de produto nem canal de venda. O projeto aplica, com dados reais, o pipeline completo de pré-processamento, engenharia de atributos com controle de data leakage e comparação de modelos ensinado até a Aula 8 da disciplina. Como próximos passos, o grupo pretende segmentar os clientes com K-Means sobre as mesmas variáveis RFM, quando o conteúdo for apresentado em aula, e testar novas variáveis, como intervalo médio entre compras, país e categoria dos produtos.</w:t>
+        <w:t>Limitações: o dataset cobre um único varejista do Reino Unido durante um ano; um quarto das transações não tem identificação de cliente e fica fora da análise; a Frequência conta também notas fiscais de cancelamento; o cenário de lucro usa custo e retorno hipotéticos, e o efeito real de uma campanha só se mede com grupo de controle; e as seis variáveis RFM não capturam sazonalidade, categoria de produto nem canal de venda. O projeto aplica, com dados reais, o pipeline completo de pré-processamento, engenharia de atributos com controle de data leakage e comparação de modelos ensinado até a Aula 8 da disciplina.</w:t>
       </w:r>
     </w:p>
     <w:p>
@@ -8256,47 +8256,6 @@
                 <w:sz w:val="20"/>
               </w:rPr>
               <w:t>06/11/2026</w:t>
-            </w:r>
-          </w:p>
-        </w:tc>
-      </w:tr>
-      <w:tr>
-        <w:trPr>
-          <w:cantSplit/>
-        </w:trPr>
-        <w:tc>
-          <w:tcPr>
-            <w:tcW w:type="dxa" w:w="4702"/>
-          </w:tcPr>
-          <w:p>
-            <w:pPr>
-              <w:keepNext/>
-            </w:pPr>
-            <w:r/>
-            <w:r>
-              <w:rPr>
-                <w:rFonts w:ascii="Times New Roman" w:hAnsi="Times New Roman"/>
-                <w:sz w:val="20"/>
-              </w:rPr>
-              <w:t>Segmentação de clientes com K-Means, após conteúdo em aula</w:t>
-            </w:r>
-          </w:p>
-        </w:tc>
-        <w:tc>
-          <w:tcPr>
-            <w:tcW w:type="dxa" w:w="4702"/>
-          </w:tcPr>
-          <w:p>
-            <w:pPr>
-              <w:keepNext/>
-            </w:pPr>
-            <w:r/>
-            <w:r>
-              <w:rPr>
-                <w:rFonts w:ascii="Times New Roman" w:hAnsi="Times New Roman"/>
-                <w:sz w:val="20"/>
-              </w:rPr>
-              <w:t>A definir</w:t>
             </w:r>
           </w:p>
         </w:tc>

</xml_diff>